<commit_message>
basic software project setup Add planning
</commit_message>
<xml_diff>
--- a/documents/JAVA PROJECT.docx
+++ b/documents/JAVA PROJECT.docx
@@ -632,25 +632,41 @@
         <w:rPr>
           <w:b/>
           <w:bCs/>
-        </w:rPr>
-      </w:pPr>
-      <w:r>
+          <w:highlight w:val="green"/>
+        </w:rPr>
+      </w:pPr>
+      <w:r>
+        <w:rPr>
+          <w:highlight w:val="green"/>
+        </w:rPr>
         <w:t xml:space="preserve">GitHub </w:t>
       </w:r>
       <w:proofErr w:type="spellStart"/>
       <w:r>
+        <w:rPr>
+          <w:highlight w:val="green"/>
+        </w:rPr>
         <w:t>reposistory</w:t>
       </w:r>
       <w:proofErr w:type="spellEnd"/>
       <w:r>
+        <w:rPr>
+          <w:highlight w:val="green"/>
+        </w:rPr>
         <w:t xml:space="preserve"> </w:t>
       </w:r>
       <w:proofErr w:type="spellStart"/>
       <w:r>
+        <w:rPr>
+          <w:highlight w:val="green"/>
+        </w:rPr>
         <w:t>aamaken</w:t>
       </w:r>
       <w:proofErr w:type="spellEnd"/>
       <w:r>
+        <w:rPr>
+          <w:highlight w:val="green"/>
+        </w:rPr>
         <w:t xml:space="preserve"> </w:t>
       </w:r>
     </w:p>
@@ -664,9 +680,13 @@
         <w:rPr>
           <w:b/>
           <w:bCs/>
-        </w:rPr>
-      </w:pPr>
-      <w:r>
+          <w:highlight w:val="green"/>
+        </w:rPr>
+      </w:pPr>
+      <w:r>
+        <w:rPr>
+          <w:highlight w:val="green"/>
+        </w:rPr>
         <w:t>README aanmaken</w:t>
       </w:r>
     </w:p>
@@ -680,17 +700,27 @@
         <w:rPr>
           <w:b/>
           <w:bCs/>
-        </w:rPr>
-      </w:pPr>
-      <w:r>
+          <w:highlight w:val="green"/>
+        </w:rPr>
+      </w:pPr>
+      <w:r>
+        <w:rPr>
+          <w:highlight w:val="green"/>
+        </w:rPr>
         <w:t xml:space="preserve">User </w:t>
       </w:r>
       <w:proofErr w:type="spellStart"/>
       <w:r>
+        <w:rPr>
+          <w:highlight w:val="green"/>
+        </w:rPr>
         <w:t>stories</w:t>
       </w:r>
       <w:proofErr w:type="spellEnd"/>
       <w:r>
+        <w:rPr>
+          <w:highlight w:val="green"/>
+        </w:rPr>
         <w:t xml:space="preserve"> uitschrijven</w:t>
       </w:r>
     </w:p>
@@ -704,121 +734,121 @@
         <w:rPr>
           <w:b/>
           <w:bCs/>
-        </w:rPr>
-      </w:pPr>
+          <w:highlight w:val="green"/>
+        </w:rPr>
+      </w:pPr>
+      <w:r>
+        <w:rPr>
+          <w:highlight w:val="green"/>
+        </w:rPr>
+        <w:t xml:space="preserve">Start maken aan de product </w:t>
+      </w:r>
       <w:proofErr w:type="spellStart"/>
       <w:r>
-        <w:t>Acceptance</w:t>
+        <w:rPr>
+          <w:highlight w:val="green"/>
+        </w:rPr>
+        <w:t>backlog</w:t>
       </w:r>
       <w:proofErr w:type="spellEnd"/>
-      <w:r>
-        <w:t xml:space="preserve"> criteria toevoegen aan elke user story </w:t>
-      </w:r>
-    </w:p>
-    <w:p>
-      <w:pPr>
-        <w:pStyle w:val="Lijstalinea"/>
-        <w:numPr>
-          <w:ilvl w:val="0"/>
-          <w:numId w:val="1"/>
-        </w:numPr>
-        <w:rPr>
-          <w:b/>
-          <w:bCs/>
-        </w:rPr>
-      </w:pPr>
-      <w:r>
-        <w:t xml:space="preserve">Start maken aan de product </w:t>
+    </w:p>
+    <w:p>
+      <w:pPr>
+        <w:pStyle w:val="Lijstalinea"/>
+        <w:numPr>
+          <w:ilvl w:val="0"/>
+          <w:numId w:val="1"/>
+        </w:numPr>
+        <w:rPr>
+          <w:b/>
+          <w:bCs/>
+          <w:highlight w:val="green"/>
+        </w:rPr>
+      </w:pPr>
+      <w:r>
+        <w:rPr>
+          <w:highlight w:val="green"/>
+        </w:rPr>
+        <w:t xml:space="preserve">Overzicht maken van alle benodigde classes </w:t>
+      </w:r>
+    </w:p>
+    <w:p>
+      <w:pPr>
+        <w:rPr>
+          <w:b/>
+          <w:bCs/>
+        </w:rPr>
+      </w:pPr>
+      <w:r>
+        <w:rPr>
+          <w:b/>
+          <w:bCs/>
+        </w:rPr>
+        <w:t xml:space="preserve">Zaterdag : </w:t>
+      </w:r>
+    </w:p>
+    <w:p>
+      <w:pPr>
+        <w:rPr>
+          <w:b/>
+          <w:bCs/>
+        </w:rPr>
+      </w:pPr>
+      <w:r>
+        <w:rPr>
+          <w:b/>
+          <w:bCs/>
+        </w:rPr>
+        <w:t xml:space="preserve">Product </w:t>
       </w:r>
       <w:proofErr w:type="spellStart"/>
       <w:r>
+        <w:rPr>
+          <w:b/>
+          <w:bCs/>
+        </w:rPr>
         <w:t>backlog</w:t>
       </w:r>
       <w:proofErr w:type="spellEnd"/>
-    </w:p>
-    <w:p>
-      <w:pPr>
-        <w:pStyle w:val="Lijstalinea"/>
-        <w:numPr>
-          <w:ilvl w:val="0"/>
-          <w:numId w:val="1"/>
-        </w:numPr>
-        <w:rPr>
-          <w:b/>
-          <w:bCs/>
-        </w:rPr>
-      </w:pPr>
-      <w:r>
-        <w:t xml:space="preserve">Overzicht maken van alle benodigde classes </w:t>
-      </w:r>
-    </w:p>
-    <w:p>
-      <w:pPr>
-        <w:rPr>
-          <w:b/>
-          <w:bCs/>
-        </w:rPr>
-      </w:pPr>
-      <w:r>
-        <w:rPr>
-          <w:b/>
-          <w:bCs/>
-        </w:rPr>
-        <w:t xml:space="preserve">Zaterdag : </w:t>
-      </w:r>
-    </w:p>
-    <w:p>
-      <w:pPr>
-        <w:rPr>
-          <w:b/>
-          <w:bCs/>
-        </w:rPr>
-      </w:pPr>
-      <w:r>
-        <w:rPr>
-          <w:b/>
-          <w:bCs/>
+      <w:r>
+        <w:rPr>
+          <w:b/>
+          <w:bCs/>
+        </w:rPr>
+        <w:t xml:space="preserve"> &amp; basiscode</w:t>
+      </w:r>
+    </w:p>
+    <w:p>
+      <w:pPr>
+        <w:pStyle w:val="Lijstalinea"/>
+        <w:numPr>
+          <w:ilvl w:val="0"/>
+          <w:numId w:val="1"/>
+        </w:numPr>
+        <w:rPr>
+          <w:b/>
+          <w:bCs/>
+          <w:highlight w:val="green"/>
+        </w:rPr>
+      </w:pPr>
+      <w:r>
+        <w:rPr>
+          <w:highlight w:val="green"/>
         </w:rPr>
         <w:t xml:space="preserve">Product </w:t>
       </w:r>
       <w:proofErr w:type="spellStart"/>
       <w:r>
         <w:rPr>
-          <w:b/>
-          <w:bCs/>
+          <w:highlight w:val="green"/>
         </w:rPr>
         <w:t>backlog</w:t>
       </w:r>
       <w:proofErr w:type="spellEnd"/>
       <w:r>
         <w:rPr>
-          <w:b/>
-          <w:bCs/>
-        </w:rPr>
-        <w:t xml:space="preserve"> &amp; basiscode</w:t>
-      </w:r>
-    </w:p>
-    <w:p>
-      <w:pPr>
-        <w:pStyle w:val="Lijstalinea"/>
-        <w:numPr>
-          <w:ilvl w:val="0"/>
-          <w:numId w:val="1"/>
-        </w:numPr>
-        <w:rPr>
-          <w:b/>
-          <w:bCs/>
-        </w:rPr>
-      </w:pPr>
-      <w:r>
-        <w:t xml:space="preserve">Product </w:t>
-      </w:r>
-      <w:proofErr w:type="spellStart"/>
-      <w:r>
-        <w:t>backlog</w:t>
-      </w:r>
-      <w:proofErr w:type="spellEnd"/>
-      <w:r>
+          <w:highlight w:val="green"/>
+        </w:rPr>
         <w:t xml:space="preserve"> vervolledigen in Excel</w:t>
       </w:r>
     </w:p>

</xml_diff>

<commit_message>
basic software project setup Add planning add user stories classes defined
</commit_message>
<xml_diff>
--- a/documents/JAVA PROJECT.docx
+++ b/documents/JAVA PROJECT.docx
@@ -25,41 +25,24 @@
         </w:rPr>
         <w:t xml:space="preserve">Voorlopige </w:t>
       </w:r>
-      <w:proofErr w:type="spellStart"/>
-      <w:r>
-        <w:rPr>
-          <w:b/>
-          <w:bCs/>
-        </w:rPr>
-        <w:t>To</w:t>
-      </w:r>
-      <w:proofErr w:type="spellEnd"/>
-      <w:r>
-        <w:rPr>
-          <w:b/>
-          <w:bCs/>
-        </w:rPr>
-        <w:t xml:space="preserve"> -do lijst :</w:t>
-      </w:r>
-    </w:p>
-    <w:p>
-      <w:pPr>
-        <w:pStyle w:val="Lijstalinea"/>
-        <w:numPr>
-          <w:ilvl w:val="0"/>
-          <w:numId w:val="1"/>
-        </w:numPr>
-      </w:pPr>
-      <w:r>
-        <w:t xml:space="preserve">GitHub </w:t>
-      </w:r>
-      <w:proofErr w:type="spellStart"/>
-      <w:r>
-        <w:t>repository</w:t>
-      </w:r>
-      <w:proofErr w:type="spellEnd"/>
-      <w:r>
-        <w:t xml:space="preserve"> aanmaken</w:t>
+      <w:r>
+        <w:rPr>
+          <w:b/>
+          <w:bCs/>
+        </w:rPr>
+        <w:t>To -do lijst :</w:t>
+      </w:r>
+    </w:p>
+    <w:p>
+      <w:pPr>
+        <w:pStyle w:val="Lijstalinea"/>
+        <w:numPr>
+          <w:ilvl w:val="0"/>
+          <w:numId w:val="1"/>
+        </w:numPr>
+      </w:pPr>
+      <w:r>
+        <w:t>GitHub repository aanmaken</w:t>
       </w:r>
     </w:p>
     <w:p>
@@ -146,15 +129,7 @@
         </w:numPr>
       </w:pPr>
       <w:r>
-        <w:t xml:space="preserve">Steward, conducteur, </w:t>
-      </w:r>
-      <w:proofErr w:type="spellStart"/>
-      <w:r>
-        <w:t>bagagePersoneel</w:t>
-      </w:r>
-      <w:proofErr w:type="spellEnd"/>
-      <w:r>
-        <w:t xml:space="preserve"> laten erven van Personeelslid</w:t>
+        <w:t>Steward, conducteur, bagagePersoneel laten erven van Personeelslid</w:t>
       </w:r>
     </w:p>
     <w:p>
@@ -283,46 +258,22 @@
         </w:rPr>
       </w:pPr>
       <w:r>
-        <w:t xml:space="preserve">Klasse </w:t>
-      </w:r>
-      <w:proofErr w:type="spellStart"/>
-      <w:r>
-        <w:t>enum</w:t>
-      </w:r>
-      <w:proofErr w:type="spellEnd"/>
-      <w:r>
-        <w:t xml:space="preserve"> ( Eerste / Tweede)</w:t>
-      </w:r>
-    </w:p>
-    <w:p>
-      <w:pPr>
-        <w:rPr>
-          <w:b/>
-          <w:bCs/>
-        </w:rPr>
-      </w:pPr>
-      <w:r>
-        <w:rPr>
-          <w:b/>
-          <w:bCs/>
-        </w:rPr>
-        <w:t>Applicatie (</w:t>
-      </w:r>
-      <w:proofErr w:type="spellStart"/>
-      <w:r>
-        <w:rPr>
-          <w:b/>
-          <w:bCs/>
-        </w:rPr>
-        <w:t>Main</w:t>
-      </w:r>
-      <w:proofErr w:type="spellEnd"/>
-      <w:r>
-        <w:rPr>
-          <w:b/>
-          <w:bCs/>
-        </w:rPr>
-        <w:t xml:space="preserve">): </w:t>
+        <w:t>Klasse enum ( Eerste / Tweede)</w:t>
+      </w:r>
+    </w:p>
+    <w:p>
+      <w:pPr>
+        <w:rPr>
+          <w:b/>
+          <w:bCs/>
+        </w:rPr>
+      </w:pPr>
+      <w:r>
+        <w:rPr>
+          <w:b/>
+          <w:bCs/>
+        </w:rPr>
+        <w:t xml:space="preserve">Applicatie (Main): </w:t>
       </w:r>
     </w:p>
     <w:p>
@@ -465,15 +416,7 @@
         </w:rPr>
       </w:pPr>
       <w:r>
-        <w:t>Opslaan als .</w:t>
-      </w:r>
-      <w:proofErr w:type="spellStart"/>
-      <w:r>
-        <w:t>txt</w:t>
-      </w:r>
-      <w:proofErr w:type="spellEnd"/>
-      <w:r>
-        <w:t xml:space="preserve"> bestand met juiste naam</w:t>
+        <w:t>Opslaan als .txt bestand met juiste naam</w:t>
       </w:r>
     </w:p>
     <w:p>
@@ -539,15 +482,7 @@
         </w:rPr>
       </w:pPr>
       <w:r>
-        <w:t xml:space="preserve">Laatste </w:t>
-      </w:r>
-      <w:proofErr w:type="spellStart"/>
-      <w:r>
-        <w:t>commit</w:t>
-      </w:r>
-      <w:proofErr w:type="spellEnd"/>
-      <w:r>
-        <w:t xml:space="preserve"> &amp; push naar GitHub</w:t>
+        <w:t>Laatste commit &amp; push naar GitHub</w:t>
       </w:r>
     </w:p>
     <w:p>
@@ -639,238 +574,143 @@
         <w:rPr>
           <w:highlight w:val="green"/>
         </w:rPr>
-        <w:t xml:space="preserve">GitHub </w:t>
-      </w:r>
-      <w:proofErr w:type="spellStart"/>
+        <w:t>GitHub reposistory aamaken</w:t>
+      </w:r>
       <w:r>
         <w:rPr>
           <w:highlight w:val="green"/>
         </w:rPr>
-        <w:t>reposistory</w:t>
-      </w:r>
-      <w:proofErr w:type="spellEnd"/>
-      <w:r>
-        <w:rPr>
+        <w:t xml:space="preserve"> </w:t>
+      </w:r>
+    </w:p>
+    <w:p>
+      <w:pPr>
+        <w:pStyle w:val="Lijstalinea"/>
+        <w:numPr>
+          <w:ilvl w:val="0"/>
+          <w:numId w:val="1"/>
+        </w:numPr>
+        <w:rPr>
+          <w:b/>
+          <w:bCs/>
           <w:highlight w:val="green"/>
         </w:rPr>
-        <w:t xml:space="preserve"> </w:t>
-      </w:r>
-      <w:proofErr w:type="spellStart"/>
+      </w:pPr>
       <w:r>
         <w:rPr>
           <w:highlight w:val="green"/>
         </w:rPr>
-        <w:t>aamaken</w:t>
-      </w:r>
-      <w:proofErr w:type="spellEnd"/>
-      <w:r>
-        <w:rPr>
+        <w:t>README aanmaken</w:t>
+      </w:r>
+    </w:p>
+    <w:p>
+      <w:pPr>
+        <w:pStyle w:val="Lijstalinea"/>
+        <w:numPr>
+          <w:ilvl w:val="0"/>
+          <w:numId w:val="1"/>
+        </w:numPr>
+        <w:rPr>
+          <w:b/>
+          <w:bCs/>
           <w:highlight w:val="green"/>
         </w:rPr>
-        <w:t xml:space="preserve"> </w:t>
-      </w:r>
-    </w:p>
-    <w:p>
-      <w:pPr>
-        <w:pStyle w:val="Lijstalinea"/>
-        <w:numPr>
-          <w:ilvl w:val="0"/>
-          <w:numId w:val="1"/>
-        </w:numPr>
-        <w:rPr>
-          <w:b/>
-          <w:bCs/>
+      </w:pPr>
+      <w:r>
+        <w:rPr>
           <w:highlight w:val="green"/>
         </w:rPr>
-      </w:pPr>
-      <w:r>
-        <w:rPr>
+        <w:t>User stories uitschrijven</w:t>
+      </w:r>
+    </w:p>
+    <w:p>
+      <w:pPr>
+        <w:pStyle w:val="Lijstalinea"/>
+        <w:numPr>
+          <w:ilvl w:val="0"/>
+          <w:numId w:val="1"/>
+        </w:numPr>
+        <w:rPr>
+          <w:b/>
+          <w:bCs/>
           <w:highlight w:val="green"/>
         </w:rPr>
-        <w:t>README aanmaken</w:t>
-      </w:r>
-    </w:p>
-    <w:p>
-      <w:pPr>
-        <w:pStyle w:val="Lijstalinea"/>
-        <w:numPr>
-          <w:ilvl w:val="0"/>
-          <w:numId w:val="1"/>
-        </w:numPr>
-        <w:rPr>
-          <w:b/>
-          <w:bCs/>
+      </w:pPr>
+      <w:r>
+        <w:rPr>
           <w:highlight w:val="green"/>
         </w:rPr>
-      </w:pPr>
-      <w:r>
-        <w:rPr>
+        <w:t>Start maken aan de product backlog</w:t>
+      </w:r>
+    </w:p>
+    <w:p>
+      <w:pPr>
+        <w:pStyle w:val="Lijstalinea"/>
+        <w:numPr>
+          <w:ilvl w:val="0"/>
+          <w:numId w:val="1"/>
+        </w:numPr>
+        <w:rPr>
+          <w:b/>
+          <w:bCs/>
           <w:highlight w:val="green"/>
         </w:rPr>
-        <w:t xml:space="preserve">User </w:t>
-      </w:r>
-      <w:proofErr w:type="spellStart"/>
+      </w:pPr>
       <w:r>
         <w:rPr>
           <w:highlight w:val="green"/>
         </w:rPr>
-        <w:t>stories</w:t>
-      </w:r>
-      <w:proofErr w:type="spellEnd"/>
-      <w:r>
-        <w:rPr>
+        <w:t xml:space="preserve">Overzicht maken van alle benodigde classes </w:t>
+      </w:r>
+    </w:p>
+    <w:p>
+      <w:pPr>
+        <w:rPr>
+          <w:b/>
+          <w:bCs/>
+        </w:rPr>
+      </w:pPr>
+      <w:r>
+        <w:rPr>
+          <w:b/>
+          <w:bCs/>
+        </w:rPr>
+        <w:t xml:space="preserve">Zaterdag : </w:t>
+      </w:r>
+    </w:p>
+    <w:p>
+      <w:pPr>
+        <w:rPr>
+          <w:b/>
+          <w:bCs/>
+        </w:rPr>
+      </w:pPr>
+      <w:r>
+        <w:rPr>
+          <w:b/>
+          <w:bCs/>
+        </w:rPr>
+        <w:t>Product backlog &amp; basiscode</w:t>
+      </w:r>
+    </w:p>
+    <w:p>
+      <w:pPr>
+        <w:pStyle w:val="Lijstalinea"/>
+        <w:numPr>
+          <w:ilvl w:val="0"/>
+          <w:numId w:val="1"/>
+        </w:numPr>
+        <w:rPr>
+          <w:b/>
+          <w:bCs/>
           <w:highlight w:val="green"/>
         </w:rPr>
-        <w:t xml:space="preserve"> uitschrijven</w:t>
-      </w:r>
-    </w:p>
-    <w:p>
-      <w:pPr>
-        <w:pStyle w:val="Lijstalinea"/>
-        <w:numPr>
-          <w:ilvl w:val="0"/>
-          <w:numId w:val="1"/>
-        </w:numPr>
-        <w:rPr>
-          <w:b/>
-          <w:bCs/>
+      </w:pPr>
+      <w:r>
+        <w:rPr>
           <w:highlight w:val="green"/>
         </w:rPr>
-      </w:pPr>
-      <w:r>
-        <w:rPr>
-          <w:highlight w:val="green"/>
-        </w:rPr>
-        <w:t xml:space="preserve">Start maken aan de product </w:t>
-      </w:r>
-      <w:proofErr w:type="spellStart"/>
-      <w:r>
-        <w:rPr>
-          <w:highlight w:val="green"/>
-        </w:rPr>
-        <w:t>backlog</w:t>
-      </w:r>
-      <w:proofErr w:type="spellEnd"/>
-    </w:p>
-    <w:p>
-      <w:pPr>
-        <w:pStyle w:val="Lijstalinea"/>
-        <w:numPr>
-          <w:ilvl w:val="0"/>
-          <w:numId w:val="1"/>
-        </w:numPr>
-        <w:rPr>
-          <w:b/>
-          <w:bCs/>
-          <w:highlight w:val="green"/>
-        </w:rPr>
-      </w:pPr>
-      <w:r>
-        <w:rPr>
-          <w:highlight w:val="green"/>
-        </w:rPr>
-        <w:t xml:space="preserve">Overzicht maken van alle benodigde classes </w:t>
-      </w:r>
-    </w:p>
-    <w:p>
-      <w:pPr>
-        <w:rPr>
-          <w:b/>
-          <w:bCs/>
-        </w:rPr>
-      </w:pPr>
-      <w:r>
-        <w:rPr>
-          <w:b/>
-          <w:bCs/>
-        </w:rPr>
-        <w:t xml:space="preserve">Zaterdag : </w:t>
-      </w:r>
-    </w:p>
-    <w:p>
-      <w:pPr>
-        <w:rPr>
-          <w:b/>
-          <w:bCs/>
-        </w:rPr>
-      </w:pPr>
-      <w:r>
-        <w:rPr>
-          <w:b/>
-          <w:bCs/>
-        </w:rPr>
-        <w:t xml:space="preserve">Product </w:t>
-      </w:r>
-      <w:proofErr w:type="spellStart"/>
-      <w:r>
-        <w:rPr>
-          <w:b/>
-          <w:bCs/>
-        </w:rPr>
-        <w:t>backlog</w:t>
-      </w:r>
-      <w:proofErr w:type="spellEnd"/>
-      <w:r>
-        <w:rPr>
-          <w:b/>
-          <w:bCs/>
-        </w:rPr>
-        <w:t xml:space="preserve"> &amp; basiscode</w:t>
-      </w:r>
-    </w:p>
-    <w:p>
-      <w:pPr>
-        <w:pStyle w:val="Lijstalinea"/>
-        <w:numPr>
-          <w:ilvl w:val="0"/>
-          <w:numId w:val="1"/>
-        </w:numPr>
-        <w:rPr>
-          <w:b/>
-          <w:bCs/>
-          <w:highlight w:val="green"/>
-        </w:rPr>
-      </w:pPr>
-      <w:r>
-        <w:rPr>
-          <w:highlight w:val="green"/>
-        </w:rPr>
-        <w:t xml:space="preserve">Product </w:t>
-      </w:r>
-      <w:proofErr w:type="spellStart"/>
-      <w:r>
-        <w:rPr>
-          <w:highlight w:val="green"/>
-        </w:rPr>
-        <w:t>backlog</w:t>
-      </w:r>
-      <w:proofErr w:type="spellEnd"/>
-      <w:r>
-        <w:rPr>
-          <w:highlight w:val="green"/>
-        </w:rPr>
-        <w:t xml:space="preserve"> vervolledigen in Excel</w:t>
-      </w:r>
-    </w:p>
-    <w:p>
-      <w:pPr>
-        <w:pStyle w:val="Lijstalinea"/>
-        <w:numPr>
-          <w:ilvl w:val="0"/>
-          <w:numId w:val="1"/>
-        </w:numPr>
-        <w:rPr>
-          <w:b/>
-          <w:bCs/>
-        </w:rPr>
-      </w:pPr>
-      <w:proofErr w:type="spellStart"/>
-      <w:r>
-        <w:t>Acceptance</w:t>
-      </w:r>
-      <w:proofErr w:type="spellEnd"/>
-      <w:r>
-        <w:t xml:space="preserve"> criteria omzetten naar taken </w:t>
+        <w:t>Product backlog vervolledigen in Excel</w:t>
       </w:r>
     </w:p>
     <w:p>
@@ -950,13 +790,8 @@
         </w:rPr>
       </w:pPr>
       <w:r>
-        <w:t xml:space="preserve">Steward / Conducteur / </w:t>
-      </w:r>
-      <w:proofErr w:type="spellStart"/>
-      <w:r>
-        <w:t>BagagePersoneel</w:t>
-      </w:r>
-      <w:proofErr w:type="spellEnd"/>
+        <w:t>Steward / Conducteur / BagagePersoneel</w:t>
+      </w:r>
     </w:p>
     <w:p>
       <w:pPr>
@@ -1196,13 +1031,8 @@
         </w:rPr>
       </w:pPr>
       <w:r>
-        <w:t xml:space="preserve">Klasse </w:t>
-      </w:r>
-      <w:proofErr w:type="spellStart"/>
-      <w:r>
-        <w:t>enum</w:t>
-      </w:r>
-      <w:proofErr w:type="spellEnd"/>
+        <w:t>Klasse enum</w:t>
+      </w:r>
     </w:p>
     <w:p>
       <w:pPr>
@@ -1343,23 +1173,7 @@
         </w:rPr>
       </w:pPr>
       <w:r>
-        <w:t xml:space="preserve">Laatste </w:t>
-      </w:r>
-      <w:proofErr w:type="spellStart"/>
-      <w:r>
-        <w:t>commits</w:t>
-      </w:r>
-      <w:proofErr w:type="spellEnd"/>
-      <w:r>
-        <w:t xml:space="preserve"> </w:t>
-      </w:r>
-      <w:proofErr w:type="spellStart"/>
-      <w:r>
-        <w:t>and</w:t>
-      </w:r>
-      <w:proofErr w:type="spellEnd"/>
-      <w:r>
-        <w:t xml:space="preserve"> push</w:t>
+        <w:t>Laatste commits and push</w:t>
       </w:r>
     </w:p>
     <w:p>

</xml_diff>